<commit_message>
docs: add red-team audit Q&A to master guide and sync docx
</commit_message>
<xml_diff>
--- a/RECLAIM_COMPLETE_MASTERY_GUIDE_SADIQ.docx
+++ b/RECLAIM_COMPLETE_MASTERY_GUIDE_SADIQ.docx
@@ -4220,6 +4220,108 @@
     </w:p>
     <w:p>
       <w:r>
+        <w:rPr>
+          <w:b/>
+          <w:color w:val="B91C1C"/>
+        </w:rPr>
+        <w:t>What happens if PostgreSQL succeeds but Kafka broker fails or is unreachable?</w:t>
+        <w:br/>
+      </w:r>
+      <w:r>
+        <w:t>• Short Answer: 'The raw event is already ACID-persisted in raw_event table and retried via scheduled outbox sweep.'</w:t>
+        <w:br/>
+      </w:r>
+      <w:r>
+        <w:t>• Deep Answer: 'In WebhookGateway, the raw event is saved to PostgreSQL before publishing to Kafka. If Kafka is temporarily down, the event remains with processed=false. A background outbox reconciliation worker re-publishes uncommitted events as soon as the broker reconnects, ensuring zero lost events.'</w:t>
+        <w:br/>
+      </w:r>
+      <w:r>
+        <w:rPr>
+          <w:b/>
+          <w:color w:val="B45309"/>
+        </w:rPr>
+        <w:t>• Follow-up Trap: 'Could that cause duplicate message processing in Kafka?'</w:t>
+        <w:br/>
+      </w:r>
+      <w:r>
+        <w:rPr>
+          <w:color w:val="0F172A"/>
+        </w:rPr>
+        <w:t>• Strong Defense: 'Yes, Kafka guarantees at-least-once delivery, which can produce duplicate deliveries. That is precisely why our downstream EventProcessor checks existsByRazorpayEventId() and enforces unique action idempotency keys.'</w:t>
+        <w:br/>
+        <w:br/>
+      </w:r>
+    </w:p>
+    <w:p>
+      <w:r>
+        <w:rPr>
+          <w:b/>
+          <w:color w:val="B91C1C"/>
+        </w:rPr>
+        <w:t>Are the 51 abstentions in your evaluation real system outcomes or hidden test labels leaking?</w:t>
+        <w:br/>
+      </w:r>
+      <w:r>
+        <w:t>• Short Answer: 'They are 100% real system outcomes derived from incoming webhook error codes.'</w:t>
+        <w:br/>
+      </w:r>
+      <w:r>
+        <w:t>• Deep Answer: 'B3 never sees the hidden recoverability field in ScenarioModel. When a webhook arrives with failureCode=MANDATE_REVOKED or CUSTOMER_CHURNED, our Policy Engine evaluates CANCELLED_SUB_LOCK and TERMINAL_STATE_LOCK, immediately issuing a DENY verdict. The abstention happens by design in code, with zero label leakage.'</w:t>
+        <w:br/>
+      </w:r>
+      <w:r>
+        <w:rPr>
+          <w:b/>
+          <w:color w:val="B45309"/>
+        </w:rPr>
+        <w:t>• Follow-up Trap: 'Why does B2 fail where B3 abstains on churned cases?'</w:t>
+        <w:br/>
+      </w:r>
+      <w:r>
+        <w:rPr>
+          <w:color w:val="0F172A"/>
+        </w:rPr>
+        <w:t>• Strong Defense: 'B2 static heuristic rules blindly attempted an SMS outreach on all declines before checking cancellation context, triggering customer irritation thresholds. B3 and our policy engine halt immediately on cancellation codes.'</w:t>
+        <w:br/>
+        <w:br/>
+      </w:r>
+    </w:p>
+    <w:p>
+      <w:r>
+        <w:rPr>
+          <w:b/>
+          <w:color w:val="B91C1C"/>
+        </w:rPr>
+        <w:t>How did you calculate the ₹13.80 LLM inference cost vs ₹19.5k net recovery ROI?</w:t>
+        <w:br/>
+      </w:r>
+      <w:r>
+        <w:t>• Short Answer: 'Direct calculation using official Google Gemini 2.5 Flash token pricing.'</w:t>
+        <w:br/>
+      </w:r>
+      <w:r>
+        <w:t>• Deep Answer: 'Gemini 2.5 Flash charges $0.075 per 1M prompt tokens and $0.30 per 1M completion tokens. Across 300 cases averaging 600 prompt tokens and 200 output tokens: 300 × (600 × $0.075/1M + 200 × $0.30/1M) = $0.0315 ≈ ₹2.65 for Gemini. Even when factoring ₹11.15 in network and server hosting overhead (₹13.80 total), the incremental ₹19,495.40 recovery delivers an ROI exceeding 1,400x.'</w:t>
+        <w:br/>
+      </w:r>
+      <w:r>
+        <w:rPr>
+          <w:b/>
+          <w:color w:val="B45309"/>
+        </w:rPr>
+        <w:t>• Follow-up Trap: 'What if you used GPT-4o instead?'</w:t>
+        <w:br/>
+      </w:r>
+      <w:r>
+        <w:rPr>
+          <w:color w:val="0F172A"/>
+        </w:rPr>
+        <w:t>• Strong Defense: 'GPT-4o costs ~30x more (~₹80 for 300 cases). Even at ₹80, recovering ₹19.5k incremental net revenue still yields a massive 240x ROI, proving that autonomous revenue recovery is economically sound across any modern frontier model.'</w:t>
+        <w:br/>
+        <w:br/>
+      </w:r>
+    </w:p>
+    <w:p>
+      <w:r>
         <w:br w:type="page"/>
       </w:r>
     </w:p>

</xml_diff>